<commit_message>
docs: actualizar formato de historias de usuario a Como usuario en vez de persona Juliana
</commit_message>
<xml_diff>
--- a/Documentación/Entregas/Entregable 6 - Grupo 7 - Evaluacion y cambios.docx
+++ b/Documentación/Entregas/Entregable 6 - Grupo 7 - Evaluacion y cambios.docx
@@ -2997,7 +2997,7 @@
               <w:rPr>
                 <w:b/>
               </w:rPr>
-              <w:t>Historia de Usuario (Persona: Juliana)</w:t>
+              <w:t>Historia de Usuario (Rol / Acción / Beneficio)</w:t>
             </w:r>
           </w:p>
         </w:tc>
@@ -3071,7 +3071,7 @@
           </w:tcPr>
           <w:p>
             <w:r>
-              <w:t>Como Juliana, quiero que la partida empiece limpia mostrando únicamente mi presencia, para entender qué pasa sin confundirme.</w:t>
+              <w:t>Como usuario, quiero que la partida empiece limpia mostrando únicamente mi presencia, para entender qué pasa sin confundirme.</w:t>
             </w:r>
           </w:p>
         </w:tc>
@@ -3137,7 +3137,7 @@
           </w:tcPr>
           <w:p>
             <w:r>
-              <w:t>Como Juliana, quiero que mi avatar camine interactivamente por un salón acogedor, para sentirme físicamente en el mismo espacio con mis colegas.</w:t>
+              <w:t>Como usuario, quiero que mi avatar camine interactivamente por un salón acogedor, para sentirme físicamente en el mismo espacio con mis colegas.</w:t>
             </w:r>
           </w:p>
         </w:tc>
@@ -3203,7 +3203,7 @@
           </w:tcPr>
           <w:p>
             <w:r>
-              <w:t>Como Juliana, quiero que una cabina me explique la actividad antes de entrar, para no sentirme obligada ni desorientada.</w:t>
+              <w:t>Como usuario, quiero que una cabina me explique la actividad antes de entrar, para no sentirme obligado ni desorientado.</w:t>
             </w:r>
           </w:p>
         </w:tc>
@@ -3269,7 +3269,7 @@
           </w:tcPr>
           <w:p>
             <w:r>
-              <w:t>Como Juliana, quiero que cuando alguien dibuje los demás solo puedan adivinar, para evitar caos en el lienzo.</w:t>
+              <w:t>Como usuario, quiero que cuando alguien dibuje los demás solo puedan adivinar, para evitar caos en el lienzo.</w:t>
             </w:r>
           </w:p>
         </w:tc>
@@ -3335,7 +3335,7 @@
           </w:tcPr>
           <w:p>
             <w:r>
-              <w:t>Como Juliana, quiero tener un banco amplio de palabras para dibujar, para que el juego no se vuelva repetitivo.</w:t>
+              <w:t>Como usuario, quiero tener un banco amplio de palabras para dibujar, para que el juego no se vuelva repetitivo.</w:t>
             </w:r>
           </w:p>
         </w:tc>
@@ -3401,7 +3401,7 @@
           </w:tcPr>
           <w:p>
             <w:r>
-              <w:t>Como Juliana, quiero que solo pueda aportar una palabra en la cadena tras otro compañero, para respetar la dinámica colectiva.</w:t>
+              <w:t>Como usuario, quiero que solo pueda aportar una palabra en la cadena tras otro compañero, para respetar la dinámica colectiva.</w:t>
             </w:r>
           </w:p>
         </w:tc>
@@ -3467,7 +3467,7 @@
           </w:tcPr>
           <w:p>
             <w:r>
-              <w:t>Como Juliana, quiero que el sistema rechace palabras duplicadas en la cadena, para mantener el reto fresco.</w:t>
+              <w:t>Como usuario, quiero que el sistema rechace palabras duplicadas en la cadena, para mantener el reto fresco.</w:t>
             </w:r>
           </w:p>
         </w:tc>
@@ -3533,7 +3533,7 @@
           </w:tcPr>
           <w:p>
             <w:r>
-              <w:t>Como Juliana, quiero poder responder en hilos dentro de El Pasillo, para tener conversaciones informales amenas junto al café.</w:t>
+              <w:t>Como usuario, quiero poder responder en hilos dentro de El Pasillo, para tener conversaciones informales amenas junto al café.</w:t>
             </w:r>
           </w:p>
         </w:tc>
@@ -3599,7 +3599,7 @@
           </w:tcPr>
           <w:p>
             <w:r>
-              <w:t>Como Juliana, quiero jugar una Trivia con cronómetro y medallas, para sentir que gano algo en descansos rápidos de 45s.</w:t>
+              <w:t>Como usuario, quiero jugar una Trivia con cronómetro y medallas, para sentir que gano algo en descansos rápidos de 45s.</w:t>
             </w:r>
           </w:p>
         </w:tc>
@@ -3665,7 +3665,7 @@
           </w:tcPr>
           <w:p>
             <w:r>
-              <w:t>Como Juliana, quiero poder salir sin avisar en cualquier momento, para no sentir compromiso social forzado.</w:t>
+              <w:t>Como usuario, quiero poder salir sin avisar en cualquier momento, para no sentir compromiso social forzado.</w:t>
             </w:r>
           </w:p>
         </w:tc>

</xml_diff>